<commit_message>
minor changes and running
</commit_message>
<xml_diff>
--- a/Week 2/Week - 2 Report.docx
+++ b/Week 2/Week - 2 Report.docx
@@ -20,6 +20,71 @@
       </w:r>
       <w:r>
         <w:br/>
+      </w:r>
+      <w:r>
+        <w:t>Date: 20</w:t>
+      </w:r>
+      <w:r>
+        <w:rPr>
+          <w:vertAlign w:val="superscript"/>
+        </w:rPr>
+        <w:t>th</w:t>
+      </w:r>
+      <w:r>
+        <w:t xml:space="preserve"> July</w:t>
+      </w:r>
+      <w:r>
+        <w:br/>
+        <w:t xml:space="preserve">studied about continuum and sigmoid fit, used continuum on different data to see what </w:t>
+      </w:r>
+      <w:proofErr w:type="spellStart"/>
+      <w:r>
+        <w:t>typa</w:t>
+      </w:r>
+      <w:proofErr w:type="spellEnd"/>
+      <w:r>
+        <w:t xml:space="preserve"> of curve it gives and what it represents, similarly for sigmoid fitting studied the spectrum graph and the different spectral lines that were marked in the spectrum it also gave a similar curve. Continuum fits a smooth background curve using sigmoid two blended lines. </w:t>
+      </w:r>
+      <w:r>
+        <w:br/>
+      </w:r>
+      <w:r>
+        <w:br/>
+        <w:t>Date 21</w:t>
+      </w:r>
+      <w:r>
+        <w:rPr>
+          <w:vertAlign w:val="superscript"/>
+        </w:rPr>
+        <w:t>st</w:t>
+      </w:r>
+      <w:r>
+        <w:t xml:space="preserve"> July 2026 </w:t>
+      </w:r>
+      <w:r>
+        <w:br/>
+      </w:r>
+      <w:r>
+        <w:t xml:space="preserve">I used sigmoid and gaussian fitters to fit data and obtain the values of </w:t>
+      </w:r>
+      <w:proofErr w:type="spellStart"/>
+      <w:r>
+        <w:t>loglam</w:t>
+      </w:r>
+      <w:proofErr w:type="spellEnd"/>
+      <w:r>
+        <w:t xml:space="preserve"> (wavelength) where the dips are present, I took y = -4 as the threshold from which I determined the values, the region from -2 to -4 was also determined but -4 onwards was more important. After that I proceeded for 19 spectral files and found the common wavelength / spectral lines in all of them which can be further used for examining new star data as a skeleton etc.</w:t>
+      </w:r>
+      <w:r>
+        <w:br/>
+      </w:r>
+      <w:r>
+        <w:br/>
+      </w:r>
+      <w:r>
+        <w:br/>
+      </w:r>
+      <w:r>
         <w:t>Date: 22</w:t>
       </w:r>
       <w:r>
@@ -36,7 +101,20 @@
       </w:r>
       <w:r>
         <w:br/>
-        <w:t>I used sigmoid and gaussian fitters to fit data and obtain the values of loglam (wavelength) where the dips are present, I took y = -4 as the threshold from which I determined the values, the region from -2 to -4 was also determined but -4 onwards was more important. After that I proceeded for 19 spectral files and found the common wavelength / spectral lines in all of them which can be further used for examining new star data as a skeleton etc.</w:t>
+      </w:r>
+      <w:r>
+        <w:t xml:space="preserve">Tried different fitters (gaussian, </w:t>
+      </w:r>
+      <w:proofErr w:type="spellStart"/>
+      <w:r>
+        <w:t>voigt</w:t>
+      </w:r>
+      <w:proofErr w:type="spellEnd"/>
+      <w:r>
+        <w:t xml:space="preserve"> and Lorentzian) on different files to see what type of plots I can obtain, some plots</w:t>
+      </w:r>
+      <w:r>
+        <w:t xml:space="preserve"> were accurate but some represented some abnormalities that were due to the common spectral lines that we took as a benchmark</w:t>
       </w:r>
       <w:r>
         <w:br/>
@@ -59,7 +137,51 @@
       </w:r>
       <w:r>
         <w:br/>
-        <w:t>doing voigt fitting on the data, removed artifcats and cleaned the spectrum first, then cropped the spectrum to 7500A and trying to fit using voigt fitting.</w:t>
+        <w:t xml:space="preserve">doing </w:t>
+      </w:r>
+      <w:proofErr w:type="spellStart"/>
+      <w:r>
+        <w:t>voigt</w:t>
+      </w:r>
+      <w:proofErr w:type="spellEnd"/>
+      <w:r>
+        <w:t xml:space="preserve"> fitting on the data, removed </w:t>
+      </w:r>
+      <w:proofErr w:type="spellStart"/>
+      <w:r>
+        <w:t>artifcats</w:t>
+      </w:r>
+      <w:proofErr w:type="spellEnd"/>
+      <w:r>
+        <w:t xml:space="preserve"> and cleaned the spectrum first, then cropped the spectrum to 7500A and trying to fit using </w:t>
+      </w:r>
+      <w:proofErr w:type="spellStart"/>
+      <w:r>
+        <w:t>voigt</w:t>
+      </w:r>
+      <w:proofErr w:type="spellEnd"/>
+      <w:r>
+        <w:t xml:space="preserve"> fitting.</w:t>
+      </w:r>
+      <w:r>
+        <w:br/>
+      </w:r>
+      <w:r>
+        <w:br/>
+        <w:t>24</w:t>
+      </w:r>
+      <w:r>
+        <w:rPr>
+          <w:vertAlign w:val="superscript"/>
+        </w:rPr>
+        <w:t>th</w:t>
+      </w:r>
+      <w:r>
+        <w:t xml:space="preserve"> July, 2026</w:t>
+      </w:r>
+      <w:r>
+        <w:br/>
+        <w:t>Compiled the weekly report for this week for submission</w:t>
       </w:r>
       <w:r>
         <w:br/>

</xml_diff>